<commit_message>
Refocus English report on Laravel concepts over database design
Trims the Database Design section to a brief Eloquent-relationships note
and adds a new Learning Outcomes section mapping core Laravel concepts
(routing, Eloquent, Blade, Breeze auth, middleware, validation, Artisan)
to where they're applied in the project, keeping the report centered on
the Laravel course rather than database internals.

https://claude.ai/code/session_01LjWt7icRzqB4RJw4Pfgspc
</commit_message>
<xml_diff>
--- a/task-management/Task_Manager_Report_EN.docx
+++ b/task-management/Task_Manager_Report_EN.docx
@@ -2331,7 +2331,7 @@
           <w:color w:val="1E3A5F"/>
           <w:sz w:val="34"/>
         </w:rPr>
-        <w:t>4.  Database Design</w:t>
+        <w:t>4.  Data Model (Eloquent Relationships)</w:t>
       </w:r>
     </w:p>
     <w:p>
@@ -2344,639 +2344,9 @@
           <w:color w:val="1F2937"/>
           <w:sz w:val="22"/>
         </w:rPr>
-        <w:t>The system uses two primary tables connected by a one-to-many relationship: a single user can own many tasks, and each task belongs to exactly one user. Deleting a user automatically deletes all of their associated tasks via a cascading foreign key constraint (onDelete('cascade')).</w:t>
+        <w:t>Rather than focusing on database design itself, the data layer here exists mainly to show how Laravel's Eloquent ORM is used in practice. The application defines two simple models, User and Task, connected by a one-to-many relationship declared directly on the models (User::tasks() returns hasMany(Task::class) and Task::user() returns belongsTo(User::class)). A foreign key with onDelete('cascade') ensures that removing a user automatically removes their tasks — all expressed through Laravel migrations and Eloquent rather than raw SQL.</w:t>
       </w:r>
     </w:p>
-    <w:p>
-      <w:pPr>
-        <w:jc w:val="center"/>
-      </w:pPr>
-      <w:r>
-        <w:drawing>
-          <wp:inline xmlns:a="http://schemas.openxmlformats.org/drawingml/2006/main" xmlns:pic="http://schemas.openxmlformats.org/drawingml/2006/picture">
-            <wp:extent cx="5669280" cy="2576945"/>
-            <wp:docPr id="2" name="Picture 2"/>
-            <wp:cNvGraphicFramePr>
-              <a:graphicFrameLocks noChangeAspect="1"/>
-            </wp:cNvGraphicFramePr>
-            <a:graphic>
-              <a:graphicData uri="http://schemas.openxmlformats.org/drawingml/2006/picture">
-                <pic:pic>
-                  <pic:nvPicPr>
-                    <pic:cNvPr id="0" name="image.png"/>
-                    <pic:cNvPicPr/>
-                  </pic:nvPicPr>
-                  <pic:blipFill>
-                    <a:blip r:embed="rId10"/>
-                    <a:stretch>
-                      <a:fillRect/>
-                    </a:stretch>
-                  </pic:blipFill>
-                  <pic:spPr>
-                    <a:xfrm>
-                      <a:off x="0" y="0"/>
-                      <a:ext cx="5669280" cy="2576945"/>
-                    </a:xfrm>
-                    <a:prstGeom prst="rect"/>
-                  </pic:spPr>
-                </pic:pic>
-              </a:graphicData>
-            </a:graphic>
-          </wp:inline>
-        </w:drawing>
-      </w:r>
-    </w:p>
-    <w:p>
-      <w:pPr>
-        <w:jc w:val="center"/>
-      </w:pPr>
-      <w:r>
-        <w:rPr>
-          <w:i/>
-          <w:color w:val="6B7280"/>
-          <w:sz w:val="18"/>
-        </w:rPr>
-        <w:t>Figure: Entity-Relationship Diagram (users ↔ tasks)</w:t>
-      </w:r>
-    </w:p>
-    <w:p/>
-    <w:p>
-      <w:pPr>
-        <w:spacing w:before="280" w:after="100"/>
-      </w:pPr>
-      <w:r>
-        <w:rPr>
-          <w:rFonts w:ascii="Calibri" w:hAnsi="Calibri"/>
-          <w:b/>
-          <w:color w:val="2D3561"/>
-          <w:sz w:val="26"/>
-        </w:rPr>
-        <w:t>4.1  Tasks Table Schema</w:t>
-      </w:r>
-    </w:p>
-    <w:tbl>
-      <w:tblPr>
-        <w:tblStyle w:val="TableGrid"/>
-        <w:tblW w:type="auto" w:w="0"/>
-        <w:jc w:val="center"/>
-        <w:tblLook w:firstColumn="1" w:firstRow="1" w:lastColumn="0" w:lastRow="0" w:noHBand="0" w:noVBand="1" w:val="04A0"/>
-      </w:tblPr>
-      <w:tblGrid>
-        <w:gridCol w:w="3135"/>
-        <w:gridCol w:w="3135"/>
-        <w:gridCol w:w="3135"/>
-      </w:tblGrid>
-      <w:tr>
-        <w:tc>
-          <w:tcPr>
-            <w:tcW w:type="dxa" w:w="2268"/>
-            <w:vAlign w:val="center"/>
-            <w:shd w:fill="166534" w:val="clear"/>
-          </w:tcPr>
-          <w:p>
-            <w:pPr>
-              <w:jc w:val="center"/>
-            </w:pPr>
-            <w:r>
-              <w:rPr>
-                <w:rFonts w:ascii="Calibri" w:hAnsi="Calibri"/>
-                <w:b/>
-                <w:color w:val="FFFFFF"/>
-                <w:sz w:val="20"/>
-              </w:rPr>
-              <w:t>Column</w:t>
-            </w:r>
-          </w:p>
-        </w:tc>
-        <w:tc>
-          <w:tcPr>
-            <w:tcW w:type="dxa" w:w="2268"/>
-            <w:vAlign w:val="center"/>
-            <w:shd w:fill="166534" w:val="clear"/>
-          </w:tcPr>
-          <w:p>
-            <w:pPr>
-              <w:jc w:val="center"/>
-            </w:pPr>
-            <w:r>
-              <w:rPr>
-                <w:rFonts w:ascii="Calibri" w:hAnsi="Calibri"/>
-                <w:b/>
-                <w:color w:val="FFFFFF"/>
-                <w:sz w:val="20"/>
-              </w:rPr>
-              <w:t>Type</w:t>
-            </w:r>
-          </w:p>
-        </w:tc>
-        <w:tc>
-          <w:tcPr>
-            <w:tcW w:type="dxa" w:w="4819"/>
-            <w:vAlign w:val="center"/>
-            <w:shd w:fill="166534" w:val="clear"/>
-          </w:tcPr>
-          <w:p>
-            <w:pPr>
-              <w:jc w:val="center"/>
-            </w:pPr>
-            <w:r>
-              <w:rPr>
-                <w:rFonts w:ascii="Calibri" w:hAnsi="Calibri"/>
-                <w:b/>
-                <w:color w:val="FFFFFF"/>
-                <w:sz w:val="20"/>
-              </w:rPr>
-              <w:t>Description</w:t>
-            </w:r>
-          </w:p>
-        </w:tc>
-      </w:tr>
-      <w:tr>
-        <w:tc>
-          <w:tcPr>
-            <w:tcW w:type="dxa" w:w="2268"/>
-            <w:vAlign w:val="center"/>
-          </w:tcPr>
-          <w:p>
-            <w:pPr>
-              <w:jc w:val="center"/>
-            </w:pPr>
-            <w:r>
-              <w:rPr>
-                <w:rFonts w:ascii="Calibri" w:hAnsi="Calibri"/>
-                <w:color w:val="1F2937"/>
-                <w:sz w:val="19"/>
-              </w:rPr>
-              <w:t>id</w:t>
-            </w:r>
-          </w:p>
-        </w:tc>
-        <w:tc>
-          <w:tcPr>
-            <w:tcW w:type="dxa" w:w="2268"/>
-            <w:vAlign w:val="center"/>
-          </w:tcPr>
-          <w:p>
-            <w:pPr>
-              <w:jc w:val="center"/>
-            </w:pPr>
-            <w:r>
-              <w:rPr>
-                <w:rFonts w:ascii="Calibri" w:hAnsi="Calibri"/>
-                <w:color w:val="1F2937"/>
-                <w:sz w:val="19"/>
-              </w:rPr>
-              <w:t>bigint, PK</w:t>
-            </w:r>
-          </w:p>
-        </w:tc>
-        <w:tc>
-          <w:tcPr>
-            <w:tcW w:type="dxa" w:w="4819"/>
-            <w:vAlign w:val="center"/>
-          </w:tcPr>
-          <w:p>
-            <w:pPr>
-              <w:jc w:val="center"/>
-            </w:pPr>
-            <w:r>
-              <w:rPr>
-                <w:rFonts w:ascii="Calibri" w:hAnsi="Calibri"/>
-                <w:color w:val="1F2937"/>
-                <w:sz w:val="19"/>
-              </w:rPr>
-              <w:t>Auto-incrementing unique identifier</w:t>
-            </w:r>
-          </w:p>
-        </w:tc>
-      </w:tr>
-      <w:tr>
-        <w:tc>
-          <w:tcPr>
-            <w:tcW w:type="dxa" w:w="2268"/>
-            <w:vAlign w:val="center"/>
-            <w:shd w:fill="EEF2FF" w:val="clear"/>
-          </w:tcPr>
-          <w:p>
-            <w:pPr>
-              <w:jc w:val="center"/>
-            </w:pPr>
-            <w:r>
-              <w:rPr>
-                <w:rFonts w:ascii="Calibri" w:hAnsi="Calibri"/>
-                <w:color w:val="1F2937"/>
-                <w:sz w:val="19"/>
-              </w:rPr>
-              <w:t>user_id</w:t>
-            </w:r>
-          </w:p>
-        </w:tc>
-        <w:tc>
-          <w:tcPr>
-            <w:tcW w:type="dxa" w:w="2268"/>
-            <w:vAlign w:val="center"/>
-            <w:shd w:fill="EEF2FF" w:val="clear"/>
-          </w:tcPr>
-          <w:p>
-            <w:pPr>
-              <w:jc w:val="center"/>
-            </w:pPr>
-            <w:r>
-              <w:rPr>
-                <w:rFonts w:ascii="Calibri" w:hAnsi="Calibri"/>
-                <w:color w:val="1F2937"/>
-                <w:sz w:val="19"/>
-              </w:rPr>
-              <w:t>bigint, FK</w:t>
-            </w:r>
-          </w:p>
-        </w:tc>
-        <w:tc>
-          <w:tcPr>
-            <w:tcW w:type="dxa" w:w="4819"/>
-            <w:vAlign w:val="center"/>
-            <w:shd w:fill="EEF2FF" w:val="clear"/>
-          </w:tcPr>
-          <w:p>
-            <w:pPr>
-              <w:jc w:val="center"/>
-            </w:pPr>
-            <w:r>
-              <w:rPr>
-                <w:rFonts w:ascii="Calibri" w:hAnsi="Calibri"/>
-                <w:color w:val="1F2937"/>
-                <w:sz w:val="19"/>
-              </w:rPr>
-              <w:t>References users.id — the task owner (cascade on delete)</w:t>
-            </w:r>
-          </w:p>
-        </w:tc>
-      </w:tr>
-      <w:tr>
-        <w:tc>
-          <w:tcPr>
-            <w:tcW w:type="dxa" w:w="2268"/>
-            <w:vAlign w:val="center"/>
-          </w:tcPr>
-          <w:p>
-            <w:pPr>
-              <w:jc w:val="center"/>
-            </w:pPr>
-            <w:r>
-              <w:rPr>
-                <w:rFonts w:ascii="Calibri" w:hAnsi="Calibri"/>
-                <w:color w:val="1F2937"/>
-                <w:sz w:val="19"/>
-              </w:rPr>
-              <w:t>title</w:t>
-            </w:r>
-          </w:p>
-        </w:tc>
-        <w:tc>
-          <w:tcPr>
-            <w:tcW w:type="dxa" w:w="2268"/>
-            <w:vAlign w:val="center"/>
-          </w:tcPr>
-          <w:p>
-            <w:pPr>
-              <w:jc w:val="center"/>
-            </w:pPr>
-            <w:r>
-              <w:rPr>
-                <w:rFonts w:ascii="Calibri" w:hAnsi="Calibri"/>
-                <w:color w:val="1F2937"/>
-                <w:sz w:val="19"/>
-              </w:rPr>
-              <w:t>varchar(255)</w:t>
-            </w:r>
-          </w:p>
-        </w:tc>
-        <w:tc>
-          <w:tcPr>
-            <w:tcW w:type="dxa" w:w="4819"/>
-            <w:vAlign w:val="center"/>
-          </w:tcPr>
-          <w:p>
-            <w:pPr>
-              <w:jc w:val="center"/>
-            </w:pPr>
-            <w:r>
-              <w:rPr>
-                <w:rFonts w:ascii="Calibri" w:hAnsi="Calibri"/>
-                <w:color w:val="1F2937"/>
-                <w:sz w:val="19"/>
-              </w:rPr>
-              <w:t>Task title (required)</w:t>
-            </w:r>
-          </w:p>
-        </w:tc>
-      </w:tr>
-      <w:tr>
-        <w:tc>
-          <w:tcPr>
-            <w:tcW w:type="dxa" w:w="2268"/>
-            <w:vAlign w:val="center"/>
-            <w:shd w:fill="EEF2FF" w:val="clear"/>
-          </w:tcPr>
-          <w:p>
-            <w:pPr>
-              <w:jc w:val="center"/>
-            </w:pPr>
-            <w:r>
-              <w:rPr>
-                <w:rFonts w:ascii="Calibri" w:hAnsi="Calibri"/>
-                <w:color w:val="1F2937"/>
-                <w:sz w:val="19"/>
-              </w:rPr>
-              <w:t>description</w:t>
-            </w:r>
-          </w:p>
-        </w:tc>
-        <w:tc>
-          <w:tcPr>
-            <w:tcW w:type="dxa" w:w="2268"/>
-            <w:vAlign w:val="center"/>
-            <w:shd w:fill="EEF2FF" w:val="clear"/>
-          </w:tcPr>
-          <w:p>
-            <w:pPr>
-              <w:jc w:val="center"/>
-            </w:pPr>
-            <w:r>
-              <w:rPr>
-                <w:rFonts w:ascii="Calibri" w:hAnsi="Calibri"/>
-                <w:color w:val="1F2937"/>
-                <w:sz w:val="19"/>
-              </w:rPr>
-              <w:t>text, nullable</w:t>
-            </w:r>
-          </w:p>
-        </w:tc>
-        <w:tc>
-          <w:tcPr>
-            <w:tcW w:type="dxa" w:w="4819"/>
-            <w:vAlign w:val="center"/>
-            <w:shd w:fill="EEF2FF" w:val="clear"/>
-          </w:tcPr>
-          <w:p>
-            <w:pPr>
-              <w:jc w:val="center"/>
-            </w:pPr>
-            <w:r>
-              <w:rPr>
-                <w:rFonts w:ascii="Calibri" w:hAnsi="Calibri"/>
-                <w:color w:val="1F2937"/>
-                <w:sz w:val="19"/>
-              </w:rPr>
-              <w:t>Optional detailed description</w:t>
-            </w:r>
-          </w:p>
-        </w:tc>
-      </w:tr>
-      <w:tr>
-        <w:tc>
-          <w:tcPr>
-            <w:tcW w:type="dxa" w:w="2268"/>
-            <w:vAlign w:val="center"/>
-          </w:tcPr>
-          <w:p>
-            <w:pPr>
-              <w:jc w:val="center"/>
-            </w:pPr>
-            <w:r>
-              <w:rPr>
-                <w:rFonts w:ascii="Calibri" w:hAnsi="Calibri"/>
-                <w:color w:val="1F2937"/>
-                <w:sz w:val="19"/>
-              </w:rPr>
-              <w:t>status</w:t>
-            </w:r>
-          </w:p>
-        </w:tc>
-        <w:tc>
-          <w:tcPr>
-            <w:tcW w:type="dxa" w:w="2268"/>
-            <w:vAlign w:val="center"/>
-          </w:tcPr>
-          <w:p>
-            <w:pPr>
-              <w:jc w:val="center"/>
-            </w:pPr>
-            <w:r>
-              <w:rPr>
-                <w:rFonts w:ascii="Calibri" w:hAnsi="Calibri"/>
-                <w:color w:val="1F2937"/>
-                <w:sz w:val="19"/>
-              </w:rPr>
-              <w:t>enum</w:t>
-            </w:r>
-          </w:p>
-        </w:tc>
-        <w:tc>
-          <w:tcPr>
-            <w:tcW w:type="dxa" w:w="4819"/>
-            <w:vAlign w:val="center"/>
-          </w:tcPr>
-          <w:p>
-            <w:pPr>
-              <w:jc w:val="center"/>
-            </w:pPr>
-            <w:r>
-              <w:rPr>
-                <w:rFonts w:ascii="Calibri" w:hAnsi="Calibri"/>
-                <w:color w:val="1F2937"/>
-                <w:sz w:val="19"/>
-              </w:rPr>
-              <w:t>pending | in_progress | completed</w:t>
-            </w:r>
-          </w:p>
-        </w:tc>
-      </w:tr>
-      <w:tr>
-        <w:tc>
-          <w:tcPr>
-            <w:tcW w:type="dxa" w:w="2268"/>
-            <w:vAlign w:val="center"/>
-            <w:shd w:fill="EEF2FF" w:val="clear"/>
-          </w:tcPr>
-          <w:p>
-            <w:pPr>
-              <w:jc w:val="center"/>
-            </w:pPr>
-            <w:r>
-              <w:rPr>
-                <w:rFonts w:ascii="Calibri" w:hAnsi="Calibri"/>
-                <w:color w:val="1F2937"/>
-                <w:sz w:val="19"/>
-              </w:rPr>
-              <w:t>priority</w:t>
-            </w:r>
-          </w:p>
-        </w:tc>
-        <w:tc>
-          <w:tcPr>
-            <w:tcW w:type="dxa" w:w="2268"/>
-            <w:vAlign w:val="center"/>
-            <w:shd w:fill="EEF2FF" w:val="clear"/>
-          </w:tcPr>
-          <w:p>
-            <w:pPr>
-              <w:jc w:val="center"/>
-            </w:pPr>
-            <w:r>
-              <w:rPr>
-                <w:rFonts w:ascii="Calibri" w:hAnsi="Calibri"/>
-                <w:color w:val="1F2937"/>
-                <w:sz w:val="19"/>
-              </w:rPr>
-              <w:t>enum</w:t>
-            </w:r>
-          </w:p>
-        </w:tc>
-        <w:tc>
-          <w:tcPr>
-            <w:tcW w:type="dxa" w:w="4819"/>
-            <w:vAlign w:val="center"/>
-            <w:shd w:fill="EEF2FF" w:val="clear"/>
-          </w:tcPr>
-          <w:p>
-            <w:pPr>
-              <w:jc w:val="center"/>
-            </w:pPr>
-            <w:r>
-              <w:rPr>
-                <w:rFonts w:ascii="Calibri" w:hAnsi="Calibri"/>
-                <w:color w:val="1F2937"/>
-                <w:sz w:val="19"/>
-              </w:rPr>
-              <w:t>low | medium | high</w:t>
-            </w:r>
-          </w:p>
-        </w:tc>
-      </w:tr>
-      <w:tr>
-        <w:tc>
-          <w:tcPr>
-            <w:tcW w:type="dxa" w:w="2268"/>
-            <w:vAlign w:val="center"/>
-          </w:tcPr>
-          <w:p>
-            <w:pPr>
-              <w:jc w:val="center"/>
-            </w:pPr>
-            <w:r>
-              <w:rPr>
-                <w:rFonts w:ascii="Calibri" w:hAnsi="Calibri"/>
-                <w:color w:val="1F2937"/>
-                <w:sz w:val="19"/>
-              </w:rPr>
-              <w:t>due_date</w:t>
-            </w:r>
-          </w:p>
-        </w:tc>
-        <w:tc>
-          <w:tcPr>
-            <w:tcW w:type="dxa" w:w="2268"/>
-            <w:vAlign w:val="center"/>
-          </w:tcPr>
-          <w:p>
-            <w:pPr>
-              <w:jc w:val="center"/>
-            </w:pPr>
-            <w:r>
-              <w:rPr>
-                <w:rFonts w:ascii="Calibri" w:hAnsi="Calibri"/>
-                <w:color w:val="1F2937"/>
-                <w:sz w:val="19"/>
-              </w:rPr>
-              <w:t>date, nullable</w:t>
-            </w:r>
-          </w:p>
-        </w:tc>
-        <w:tc>
-          <w:tcPr>
-            <w:tcW w:type="dxa" w:w="4819"/>
-            <w:vAlign w:val="center"/>
-          </w:tcPr>
-          <w:p>
-            <w:pPr>
-              <w:jc w:val="center"/>
-            </w:pPr>
-            <w:r>
-              <w:rPr>
-                <w:rFonts w:ascii="Calibri" w:hAnsi="Calibri"/>
-                <w:color w:val="1F2937"/>
-                <w:sz w:val="19"/>
-              </w:rPr>
-              <w:t>Optional deadline date</w:t>
-            </w:r>
-          </w:p>
-        </w:tc>
-      </w:tr>
-      <w:tr>
-        <w:tc>
-          <w:tcPr>
-            <w:tcW w:type="dxa" w:w="2268"/>
-            <w:vAlign w:val="center"/>
-            <w:shd w:fill="EEF2FF" w:val="clear"/>
-          </w:tcPr>
-          <w:p>
-            <w:pPr>
-              <w:jc w:val="center"/>
-            </w:pPr>
-            <w:r>
-              <w:rPr>
-                <w:rFonts w:ascii="Calibri" w:hAnsi="Calibri"/>
-                <w:color w:val="1F2937"/>
-                <w:sz w:val="19"/>
-              </w:rPr>
-              <w:t>created_at / updated_at</w:t>
-            </w:r>
-          </w:p>
-        </w:tc>
-        <w:tc>
-          <w:tcPr>
-            <w:tcW w:type="dxa" w:w="2268"/>
-            <w:vAlign w:val="center"/>
-            <w:shd w:fill="EEF2FF" w:val="clear"/>
-          </w:tcPr>
-          <w:p>
-            <w:pPr>
-              <w:jc w:val="center"/>
-            </w:pPr>
-            <w:r>
-              <w:rPr>
-                <w:rFonts w:ascii="Calibri" w:hAnsi="Calibri"/>
-                <w:color w:val="1F2937"/>
-                <w:sz w:val="19"/>
-              </w:rPr>
-              <w:t>timestamp</w:t>
-            </w:r>
-          </w:p>
-        </w:tc>
-        <w:tc>
-          <w:tcPr>
-            <w:tcW w:type="dxa" w:w="4819"/>
-            <w:vAlign w:val="center"/>
-            <w:shd w:fill="EEF2FF" w:val="clear"/>
-          </w:tcPr>
-          <w:p>
-            <w:pPr>
-              <w:jc w:val="center"/>
-            </w:pPr>
-            <w:r>
-              <w:rPr>
-                <w:rFonts w:ascii="Calibri" w:hAnsi="Calibri"/>
-                <w:color w:val="1F2937"/>
-                <w:sz w:val="19"/>
-              </w:rPr>
-              <w:t>Automatic Laravel timestamps</w:t>
-            </w:r>
-          </w:p>
-        </w:tc>
-      </w:tr>
-    </w:tbl>
-    <w:p/>
     <w:p>
       <w:pPr>
         <w:spacing w:before="400" w:after="160"/>
@@ -3148,7 +2518,231 @@
           <w:color w:val="1E3A5F"/>
           <w:sz w:val="34"/>
         </w:rPr>
-        <w:t>6.  User Interface Walkthrough</w:t>
+        <w:t>6.  Learning Outcomes — Laravel Concepts Applied</w:t>
+      </w:r>
+    </w:p>
+    <w:p>
+      <w:pPr>
+        <w:spacing w:after="120" w:line="360" w:lineRule="auto"/>
+      </w:pPr>
+      <w:r>
+        <w:rPr>
+          <w:rFonts w:ascii="Calibri" w:hAnsi="Calibri"/>
+          <w:color w:val="1F2937"/>
+          <w:sz w:val="22"/>
+        </w:rPr>
+        <w:t>This project was built as a hands-on application of the Laravel concepts covered in the course. The list below maps each concept to where it is concretely used in the codebase.</w:t>
+      </w:r>
+    </w:p>
+    <w:p>
+      <w:pPr>
+        <w:spacing w:before="160" w:after="60"/>
+      </w:pPr>
+      <w:r>
+        <w:rPr>
+          <w:rFonts w:ascii="Calibri" w:hAnsi="Calibri"/>
+          <w:b/>
+          <w:color w:val="374151"/>
+          <w:sz w:val="23"/>
+        </w:rPr>
+        <w:t>Routing</w:t>
+      </w:r>
+    </w:p>
+    <w:p>
+      <w:pPr>
+        <w:spacing w:after="120" w:line="360" w:lineRule="auto"/>
+      </w:pPr>
+      <w:r>
+        <w:rPr>
+          <w:rFonts w:ascii="Calibri" w:hAnsi="Calibri"/>
+          <w:color w:val="1F2937"/>
+          <w:sz w:val="22"/>
+        </w:rPr>
+        <w:t>All application routes are declared in routes/web.php using Route::get/post/put/delete and resource-style grouping, with route groups that share the auth and verified middleware.</w:t>
+      </w:r>
+    </w:p>
+    <w:p>
+      <w:pPr>
+        <w:spacing w:before="160" w:after="60"/>
+      </w:pPr>
+      <w:r>
+        <w:rPr>
+          <w:rFonts w:ascii="Calibri" w:hAnsi="Calibri"/>
+          <w:b/>
+          <w:color w:val="374151"/>
+          <w:sz w:val="23"/>
+        </w:rPr>
+        <w:t>Eloquent ORM</w:t>
+      </w:r>
+    </w:p>
+    <w:p>
+      <w:pPr>
+        <w:spacing w:after="120" w:line="360" w:lineRule="auto"/>
+      </w:pPr>
+      <w:r>
+        <w:rPr>
+          <w:rFonts w:ascii="Calibri" w:hAnsi="Calibri"/>
+          <w:color w:val="1F2937"/>
+          <w:sz w:val="22"/>
+        </w:rPr>
+        <w:t>The User and Task models use Eloquent relationships (hasMany / belongsTo) and the $fillable property for safe mass assignment, replacing manual SQL queries entirely.</w:t>
+      </w:r>
+    </w:p>
+    <w:p>
+      <w:pPr>
+        <w:spacing w:before="160" w:after="60"/>
+      </w:pPr>
+      <w:r>
+        <w:rPr>
+          <w:rFonts w:ascii="Calibri" w:hAnsi="Calibri"/>
+          <w:b/>
+          <w:color w:val="374151"/>
+          <w:sz w:val="23"/>
+        </w:rPr>
+        <w:t>Blade Templating</w:t>
+      </w:r>
+    </w:p>
+    <w:p>
+      <w:pPr>
+        <w:spacing w:after="120" w:line="360" w:lineRule="auto"/>
+      </w:pPr>
+      <w:r>
+        <w:rPr>
+          <w:rFonts w:ascii="Calibri" w:hAnsi="Calibri"/>
+          <w:color w:val="1F2937"/>
+          <w:sz w:val="22"/>
+        </w:rPr>
+        <w:t>A shared layouts/app.blade.php master layout is extended by every page using @extends, @section and @yield, with @if/@foreach directives driving the dynamic task lists, badges, and statistic cards.</w:t>
+      </w:r>
+    </w:p>
+    <w:p>
+      <w:pPr>
+        <w:spacing w:before="160" w:after="60"/>
+      </w:pPr>
+      <w:r>
+        <w:rPr>
+          <w:rFonts w:ascii="Calibri" w:hAnsi="Calibri"/>
+          <w:b/>
+          <w:color w:val="374151"/>
+          <w:sz w:val="23"/>
+        </w:rPr>
+        <w:t>Authentication (Breeze)</w:t>
+      </w:r>
+    </w:p>
+    <w:p>
+      <w:pPr>
+        <w:spacing w:after="120" w:line="360" w:lineRule="auto"/>
+      </w:pPr>
+      <w:r>
+        <w:rPr>
+          <w:rFonts w:ascii="Calibri" w:hAnsi="Calibri"/>
+          <w:color w:val="1F2937"/>
+          <w:sz w:val="22"/>
+        </w:rPr>
+        <w:t>Laravel Breeze scaffolds registration, login, logout and password-reset flows out of the box, including the auth guard checks used throughout the app.</w:t>
+      </w:r>
+    </w:p>
+    <w:p>
+      <w:pPr>
+        <w:spacing w:before="160" w:after="60"/>
+      </w:pPr>
+      <w:r>
+        <w:rPr>
+          <w:rFonts w:ascii="Calibri" w:hAnsi="Calibri"/>
+          <w:b/>
+          <w:color w:val="374151"/>
+          <w:sz w:val="23"/>
+        </w:rPr>
+        <w:t>Custom Middleware</w:t>
+      </w:r>
+    </w:p>
+    <w:p>
+      <w:pPr>
+        <w:spacing w:after="120" w:line="360" w:lineRule="auto"/>
+      </w:pPr>
+      <w:r>
+        <w:rPr>
+          <w:rFonts w:ascii="Calibri" w:hAnsi="Calibri"/>
+          <w:color w:val="1F2937"/>
+          <w:sz w:val="22"/>
+        </w:rPr>
+        <w:t>Two custom middleware classes were written and registered in bootstrap/app.php: EnsureTaskOwner (authorization check on every task route) and PreventBackHistory (adds no-cache headers after logout).</w:t>
+      </w:r>
+    </w:p>
+    <w:p>
+      <w:pPr>
+        <w:spacing w:before="160" w:after="60"/>
+      </w:pPr>
+      <w:r>
+        <w:rPr>
+          <w:rFonts w:ascii="Calibri" w:hAnsi="Calibri"/>
+          <w:b/>
+          <w:color w:val="374151"/>
+          <w:sz w:val="23"/>
+        </w:rPr>
+        <w:t>Form Requests &amp; Validation</w:t>
+      </w:r>
+    </w:p>
+    <w:p>
+      <w:pPr>
+        <w:spacing w:after="120" w:line="360" w:lineRule="auto"/>
+      </w:pPr>
+      <w:r>
+        <w:rPr>
+          <w:rFonts w:ascii="Calibri" w:hAnsi="Calibri"/>
+          <w:color w:val="1F2937"/>
+          <w:sz w:val="22"/>
+        </w:rPr>
+        <w:t>Controllers validate incoming input with Laravel's validate() / Request rules before touching the database, and redirect back with errors and old() input on failure.</w:t>
+      </w:r>
+    </w:p>
+    <w:p>
+      <w:pPr>
+        <w:spacing w:before="160" w:after="60"/>
+      </w:pPr>
+      <w:r>
+        <w:rPr>
+          <w:rFonts w:ascii="Calibri" w:hAnsi="Calibri"/>
+          <w:b/>
+          <w:color w:val="374151"/>
+          <w:sz w:val="23"/>
+        </w:rPr>
+        <w:t>Artisan CLI</w:t>
+      </w:r>
+    </w:p>
+    <w:p>
+      <w:pPr>
+        <w:spacing w:after="120" w:line="360" w:lineRule="auto"/>
+      </w:pPr>
+      <w:r>
+        <w:rPr>
+          <w:rFonts w:ascii="Calibri" w:hAnsi="Calibri"/>
+          <w:color w:val="1F2937"/>
+          <w:sz w:val="22"/>
+        </w:rPr>
+        <w:t>The project was scaffolded and maintained with Artisan commands such as make:model, make:controller, make:middleware, migrate, and serve.</w:t>
+      </w:r>
+    </w:p>
+    <w:p>
+      <w:r>
+        <w:br w:type="page"/>
+      </w:r>
+    </w:p>
+    <w:p>
+      <w:pPr>
+        <w:spacing w:before="400" w:after="160"/>
+        <w:pBdr>
+          <w:bottom w:val="single" w:sz="10" w:color="667eea"/>
+        </w:pBdr>
+      </w:pPr>
+      <w:r>
+        <w:rPr>
+          <w:rFonts w:ascii="Calibri" w:hAnsi="Calibri"/>
+          <w:b/>
+          <w:color w:val="1E3A5F"/>
+          <w:sz w:val="34"/>
+        </w:rPr>
+        <w:t>7.  User Interface Walkthrough</w:t>
       </w:r>
     </w:p>
     <w:p>
@@ -3162,7 +2756,7 @@
           <w:color w:val="2D3561"/>
           <w:sz w:val="26"/>
         </w:rPr>
-        <w:t>6.1  Login Page</w:t>
+        <w:t>7.1  Login Page</w:t>
       </w:r>
     </w:p>
     <w:p>
@@ -3186,7 +2780,7 @@
         <w:drawing>
           <wp:inline xmlns:a="http://schemas.openxmlformats.org/drawingml/2006/main" xmlns:pic="http://schemas.openxmlformats.org/drawingml/2006/picture">
             <wp:extent cx="4572000" cy="2899317"/>
-            <wp:docPr id="3" name="Picture 3"/>
+            <wp:docPr id="2" name="Picture 2"/>
             <wp:cNvGraphicFramePr>
               <a:graphicFrameLocks noChangeAspect="1"/>
             </wp:cNvGraphicFramePr>
@@ -3198,7 +2792,7 @@
                     <pic:cNvPicPr/>
                   </pic:nvPicPr>
                   <pic:blipFill>
-                    <a:blip r:embed="rId11"/>
+                    <a:blip r:embed="rId10"/>
                     <a:stretch>
                       <a:fillRect/>
                     </a:stretch>
@@ -3242,7 +2836,7 @@
           <w:color w:val="2D3561"/>
           <w:sz w:val="26"/>
         </w:rPr>
-        <w:t>6.2  Dashboard</w:t>
+        <w:t>7.2  Dashboard</w:t>
       </w:r>
     </w:p>
     <w:p>
@@ -3266,7 +2860,7 @@
         <w:drawing>
           <wp:inline xmlns:a="http://schemas.openxmlformats.org/drawingml/2006/main" xmlns:pic="http://schemas.openxmlformats.org/drawingml/2006/picture">
             <wp:extent cx="5669280" cy="3202093"/>
-            <wp:docPr id="4" name="Picture 4"/>
+            <wp:docPr id="3" name="Picture 3"/>
             <wp:cNvGraphicFramePr>
               <a:graphicFrameLocks noChangeAspect="1"/>
             </wp:cNvGraphicFramePr>
@@ -3278,7 +2872,7 @@
                     <pic:cNvPicPr/>
                   </pic:nvPicPr>
                   <pic:blipFill>
-                    <a:blip r:embed="rId12"/>
+                    <a:blip r:embed="rId11"/>
                     <a:stretch>
                       <a:fillRect/>
                     </a:stretch>
@@ -3327,7 +2921,7 @@
           <w:color w:val="2D3561"/>
           <w:sz w:val="26"/>
         </w:rPr>
-        <w:t>6.3  Task List</w:t>
+        <w:t>7.3  Task List</w:t>
       </w:r>
     </w:p>
     <w:p>
@@ -3351,7 +2945,7 @@
         <w:drawing>
           <wp:inline xmlns:a="http://schemas.openxmlformats.org/drawingml/2006/main" xmlns:pic="http://schemas.openxmlformats.org/drawingml/2006/picture">
             <wp:extent cx="5669280" cy="3044613"/>
-            <wp:docPr id="5" name="Picture 5"/>
+            <wp:docPr id="4" name="Picture 4"/>
             <wp:cNvGraphicFramePr>
               <a:graphicFrameLocks noChangeAspect="1"/>
             </wp:cNvGraphicFramePr>
@@ -3363,7 +2957,7 @@
                     <pic:cNvPicPr/>
                   </pic:nvPicPr>
                   <pic:blipFill>
-                    <a:blip r:embed="rId13"/>
+                    <a:blip r:embed="rId12"/>
                     <a:stretch>
                       <a:fillRect/>
                     </a:stretch>
@@ -3407,7 +3001,7 @@
           <w:color w:val="2D3561"/>
           <w:sz w:val="26"/>
         </w:rPr>
-        <w:t>6.4  Create / Edit Task</w:t>
+        <w:t>7.4  Create / Edit Task</w:t>
       </w:r>
     </w:p>
     <w:p>
@@ -3421,6 +3015,91 @@
           <w:sz w:val="22"/>
         </w:rPr>
         <w:t>A validated form for entering or updating a task's title, description, status, priority, and due date. Validation errors are shown inline beneath each field.</w:t>
+      </w:r>
+    </w:p>
+    <w:p>
+      <w:pPr>
+        <w:jc w:val="center"/>
+      </w:pPr>
+      <w:r>
+        <w:drawing>
+          <wp:inline xmlns:a="http://schemas.openxmlformats.org/drawingml/2006/main" xmlns:pic="http://schemas.openxmlformats.org/drawingml/2006/picture">
+            <wp:extent cx="5669280" cy="2939627"/>
+            <wp:docPr id="5" name="Picture 5"/>
+            <wp:cNvGraphicFramePr>
+              <a:graphicFrameLocks noChangeAspect="1"/>
+            </wp:cNvGraphicFramePr>
+            <a:graphic>
+              <a:graphicData uri="http://schemas.openxmlformats.org/drawingml/2006/picture">
+                <pic:pic>
+                  <pic:nvPicPr>
+                    <pic:cNvPr id="0" name="image.png"/>
+                    <pic:cNvPicPr/>
+                  </pic:nvPicPr>
+                  <pic:blipFill>
+                    <a:blip r:embed="rId13"/>
+                    <a:stretch>
+                      <a:fillRect/>
+                    </a:stretch>
+                  </pic:blipFill>
+                  <pic:spPr>
+                    <a:xfrm>
+                      <a:off x="0" y="0"/>
+                      <a:ext cx="5669280" cy="2939627"/>
+                    </a:xfrm>
+                    <a:prstGeom prst="rect"/>
+                  </pic:spPr>
+                </pic:pic>
+              </a:graphicData>
+            </a:graphic>
+          </wp:inline>
+        </w:drawing>
+      </w:r>
+    </w:p>
+    <w:p>
+      <w:pPr>
+        <w:jc w:val="center"/>
+      </w:pPr>
+      <w:r>
+        <w:rPr>
+          <w:i/>
+          <w:color w:val="6B7280"/>
+          <w:sz w:val="18"/>
+        </w:rPr>
+        <w:t>Figure: Add/Edit Task form</w:t>
+      </w:r>
+    </w:p>
+    <w:p/>
+    <w:p>
+      <w:r>
+        <w:br w:type="page"/>
+      </w:r>
+    </w:p>
+    <w:p>
+      <w:pPr>
+        <w:spacing w:before="280" w:after="100"/>
+      </w:pPr>
+      <w:r>
+        <w:rPr>
+          <w:rFonts w:ascii="Calibri" w:hAnsi="Calibri"/>
+          <w:b/>
+          <w:color w:val="2D3561"/>
+          <w:sz w:val="26"/>
+        </w:rPr>
+        <w:t>7.5  Delete Confirmation Modal</w:t>
+      </w:r>
+    </w:p>
+    <w:p>
+      <w:pPr>
+        <w:spacing w:after="120" w:line="360" w:lineRule="auto"/>
+      </w:pPr>
+      <w:r>
+        <w:rPr>
+          <w:rFonts w:ascii="Calibri" w:hAnsi="Calibri"/>
+          <w:color w:val="1F2937"/>
+          <w:sz w:val="22"/>
+        </w:rPr>
+        <w:t>Instead of relying on the browser's plain confirm() dialog, the system shows a custom Bootstrap modal with a contextual icon, the task's name, and a clear warning before any destructive action.</w:t>
       </w:r>
     </w:p>
     <w:p>
@@ -3472,91 +3151,6 @@
           <w:color w:val="6B7280"/>
           <w:sz w:val="18"/>
         </w:rPr>
-        <w:t>Figure: Add/Edit Task form</w:t>
-      </w:r>
-    </w:p>
-    <w:p/>
-    <w:p>
-      <w:r>
-        <w:br w:type="page"/>
-      </w:r>
-    </w:p>
-    <w:p>
-      <w:pPr>
-        <w:spacing w:before="280" w:after="100"/>
-      </w:pPr>
-      <w:r>
-        <w:rPr>
-          <w:rFonts w:ascii="Calibri" w:hAnsi="Calibri"/>
-          <w:b/>
-          <w:color w:val="2D3561"/>
-          <w:sz w:val="26"/>
-        </w:rPr>
-        <w:t>6.5  Delete Confirmation Modal</w:t>
-      </w:r>
-    </w:p>
-    <w:p>
-      <w:pPr>
-        <w:spacing w:after="120" w:line="360" w:lineRule="auto"/>
-      </w:pPr>
-      <w:r>
-        <w:rPr>
-          <w:rFonts w:ascii="Calibri" w:hAnsi="Calibri"/>
-          <w:color w:val="1F2937"/>
-          <w:sz w:val="22"/>
-        </w:rPr>
-        <w:t>Instead of relying on the browser's plain confirm() dialog, the system shows a custom Bootstrap modal with a contextual icon, the task's name, and a clear warning before any destructive action.</w:t>
-      </w:r>
-    </w:p>
-    <w:p>
-      <w:pPr>
-        <w:jc w:val="center"/>
-      </w:pPr>
-      <w:r>
-        <w:drawing>
-          <wp:inline xmlns:a="http://schemas.openxmlformats.org/drawingml/2006/main" xmlns:pic="http://schemas.openxmlformats.org/drawingml/2006/picture">
-            <wp:extent cx="5669280" cy="2939627"/>
-            <wp:docPr id="7" name="Picture 7"/>
-            <wp:cNvGraphicFramePr>
-              <a:graphicFrameLocks noChangeAspect="1"/>
-            </wp:cNvGraphicFramePr>
-            <a:graphic>
-              <a:graphicData uri="http://schemas.openxmlformats.org/drawingml/2006/picture">
-                <pic:pic>
-                  <pic:nvPicPr>
-                    <pic:cNvPr id="0" name="image.png"/>
-                    <pic:cNvPicPr/>
-                  </pic:nvPicPr>
-                  <pic:blipFill>
-                    <a:blip r:embed="rId15"/>
-                    <a:stretch>
-                      <a:fillRect/>
-                    </a:stretch>
-                  </pic:blipFill>
-                  <pic:spPr>
-                    <a:xfrm>
-                      <a:off x="0" y="0"/>
-                      <a:ext cx="5669280" cy="2939627"/>
-                    </a:xfrm>
-                    <a:prstGeom prst="rect"/>
-                  </pic:spPr>
-                </pic:pic>
-              </a:graphicData>
-            </a:graphic>
-          </wp:inline>
-        </w:drawing>
-      </w:r>
-    </w:p>
-    <w:p>
-      <w:pPr>
-        <w:jc w:val="center"/>
-      </w:pPr>
-      <w:r>
-        <w:rPr>
-          <w:i/>
-          <w:color w:val="6B7280"/>
-          <w:sz w:val="18"/>
-        </w:rPr>
         <w:t>Figure: Delete confirmation modal</w:t>
       </w:r>
     </w:p>
@@ -3575,7 +3169,7 @@
           <w:color w:val="1E3A5F"/>
           <w:sz w:val="34"/>
         </w:rPr>
-        <w:t>7.  Security Measures</w:t>
+        <w:t>8.  Security Measures</w:t>
       </w:r>
     </w:p>
     <w:tbl>
@@ -3982,7 +3576,7 @@
           <w:color w:val="1E3A5F"/>
           <w:sz w:val="34"/>
         </w:rPr>
-        <w:t>8.  Installation &amp; Setup Guide</w:t>
+        <w:t>9.  Installation &amp; Setup Guide</w:t>
       </w:r>
     </w:p>
     <w:p>
@@ -4289,7 +3883,7 @@
           <w:color w:val="2D3561"/>
           <w:sz w:val="26"/>
         </w:rPr>
-        <w:t>8.1  Useful Artisan Commands</w:t>
+        <w:t>9.1  Useful Artisan Commands</w:t>
       </w:r>
     </w:p>
     <w:tbl>
@@ -4609,7 +4203,7 @@
           <w:color w:val="1E3A5F"/>
           <w:sz w:val="34"/>
         </w:rPr>
-        <w:t>9.  Conclusion</w:t>
+        <w:t>10.  Conclusion</w:t>
       </w:r>
     </w:p>
     <w:p>
@@ -4649,7 +4243,7 @@
           <w:color w:val="2D3561"/>
           <w:sz w:val="26"/>
         </w:rPr>
-        <w:t>9.1  Possible Future Enhancements</w:t>
+        <w:t>10.1  Possible Future Enhancements</w:t>
       </w:r>
     </w:p>
     <w:p>

</xml_diff>